<commit_message>
add repaired templates, forms.json, CLAUDE.md
</commit_message>
<xml_diff>
--- a/templates/G3-010.docx
+++ b/templates/G3-010.docx
@@ -512,15 +512,15 @@
           <w:szCs w:val="20"/>
           <w:u w:val="single"/>
         </w:rPr>
-        <w:t xml:space="preserve">                                                                                                 </w:t>
-      </w:r>
-      <w:r>
-        <w:rPr>
-          <w:rFonts w:ascii="Arial" w:hAnsi="Arial" w:cs="Arial"/>
-          <w:sz w:val="20"/>
-          <w:szCs w:val="20"/>
-        </w:rPr>
-        <w:t>, an alleged incapacitated person, but a guardian has not been appointed.</w:t>
+        <w:t xml:space="preserve">{aip_name}</w:t>
+      </w:r>
+      <w:r>
+        <w:rPr>
+          <w:rFonts w:ascii="Arial" w:hAnsi="Arial" w:cs="Arial"/>
+          <w:sz w:val="20"/>
+          <w:szCs w:val="20"/>
+        </w:rPr>
+        <w:t xml:space="preserve">, an alleged incapacitated person, but a guardian has not been appointed.</w:t>
       </w:r>
     </w:p>
     <w:p>
@@ -633,6 +633,14 @@
           <w:noEndnote/>
         </w:sectPr>
       </w:pPr>
+      <w:r>
+        <w:rPr>
+          <w:rFonts w:ascii="Arial" w:hAnsi="Arial" w:cs="Arial"/>
+          <w:sz w:val="20"/>
+          <w:szCs w:val="20"/>
+        </w:rPr>
+        <w:t xml:space="preserve">{imminent_danger_reason}</w:t>
+      </w:r>
     </w:p>
     <w:p>
       <w:pPr>
@@ -895,10 +903,7 @@
           <w:tab w:val="left" w:pos="1440"/>
           <w:tab w:val="left" w:pos="2160"/>
           <w:tab w:val="left" w:pos="2880"/>
-          <w:tab w:val="left" w:pos="3600"/>
-          <w:tab w:val="left" w:pos="4320"/>
-          <w:tab w:val="left" w:pos="5040"/>
-          <w:tab w:val="left" w:pos="5760"/>
+          <w:tab w:val="right" w:pos="9360"/>
         </w:tabs>
         <w:spacing w:line="360" w:lineRule="auto"/>
         <w:jc w:val="both"/>
@@ -908,106 +913,46 @@
           <w:szCs w:val="20"/>
         </w:rPr>
       </w:pPr>
-    </w:p>
-    <w:p>
-      <w:pPr>
-        <w:widowControl/>
-        <w:tabs>
-          <w:tab w:val="left" w:pos="-1440"/>
-          <w:tab w:val="left" w:pos="-720"/>
-          <w:tab w:val="left" w:pos="0"/>
-          <w:tab w:val="left" w:pos="720"/>
-          <w:tab w:val="left" w:pos="1440"/>
-          <w:tab w:val="left" w:pos="2160"/>
-          <w:tab w:val="left" w:pos="2880"/>
-          <w:tab w:val="left" w:pos="3600"/>
-          <w:tab w:val="left" w:pos="4320"/>
-          <w:tab w:val="left" w:pos="5040"/>
-          <w:tab w:val="left" w:pos="5760"/>
-        </w:tabs>
-        <w:spacing w:line="360" w:lineRule="auto"/>
-        <w:jc w:val="both"/>
-        <w:rPr>
-          <w:rFonts w:ascii="Arial" w:hAnsi="Arial" w:cs="Arial"/>
-          <w:sz w:val="20"/>
-          <w:szCs w:val="20"/>
-        </w:rPr>
-      </w:pPr>
-    </w:p>
-    <w:p>
-      <w:pPr>
-        <w:widowControl/>
-        <w:tabs>
-          <w:tab w:val="left" w:pos="-1440"/>
-          <w:tab w:val="left" w:pos="-720"/>
-          <w:tab w:val="left" w:pos="0"/>
-          <w:tab w:val="left" w:pos="720"/>
-          <w:tab w:val="left" w:pos="1440"/>
-          <w:tab w:val="left" w:pos="2160"/>
-          <w:tab w:val="left" w:pos="2880"/>
-          <w:tab w:val="left" w:pos="3600"/>
-          <w:tab w:val="left" w:pos="4320"/>
-          <w:tab w:val="left" w:pos="5040"/>
-          <w:tab w:val="left" w:pos="5760"/>
-        </w:tabs>
-        <w:spacing w:line="360" w:lineRule="auto"/>
-        <w:jc w:val="both"/>
-        <w:rPr>
-          <w:rFonts w:ascii="Arial" w:hAnsi="Arial" w:cs="Arial"/>
-          <w:sz w:val="20"/>
-          <w:szCs w:val="20"/>
-        </w:rPr>
-      </w:pPr>
-    </w:p>
-    <w:p>
-      <w:pPr>
-        <w:widowControl/>
-        <w:tabs>
-          <w:tab w:val="left" w:pos="-1440"/>
-          <w:tab w:val="left" w:pos="-720"/>
-          <w:tab w:val="left" w:pos="0"/>
-          <w:tab w:val="left" w:pos="720"/>
-          <w:tab w:val="left" w:pos="1440"/>
-          <w:tab w:val="left" w:pos="2160"/>
-          <w:tab w:val="left" w:pos="2880"/>
-          <w:tab w:val="left" w:pos="3600"/>
-          <w:tab w:val="left" w:pos="4320"/>
-          <w:tab w:val="left" w:pos="5040"/>
-          <w:tab w:val="left" w:pos="5760"/>
-        </w:tabs>
-        <w:spacing w:line="360" w:lineRule="auto"/>
-        <w:jc w:val="both"/>
-        <w:rPr>
-          <w:rFonts w:ascii="Arial" w:hAnsi="Arial" w:cs="Arial"/>
-          <w:sz w:val="20"/>
-          <w:szCs w:val="20"/>
-        </w:rPr>
-      </w:pPr>
-    </w:p>
-    <w:p>
-      <w:pPr>
-        <w:widowControl/>
-        <w:tabs>
-          <w:tab w:val="left" w:pos="-1440"/>
-          <w:tab w:val="left" w:pos="-720"/>
-          <w:tab w:val="left" w:pos="0"/>
-          <w:tab w:val="left" w:pos="720"/>
-          <w:tab w:val="left" w:pos="1440"/>
-          <w:tab w:val="left" w:pos="2160"/>
-          <w:tab w:val="left" w:pos="2880"/>
-          <w:tab w:val="left" w:pos="3600"/>
-          <w:tab w:val="left" w:pos="4320"/>
-          <w:tab w:val="left" w:pos="5040"/>
-          <w:tab w:val="left" w:pos="5760"/>
-        </w:tabs>
-        <w:spacing w:line="360" w:lineRule="auto"/>
-        <w:jc w:val="both"/>
-        <w:rPr>
-          <w:rFonts w:ascii="Arial" w:hAnsi="Arial" w:cs="Arial"/>
-          <w:sz w:val="20"/>
-          <w:szCs w:val="20"/>
-        </w:rPr>
-      </w:pPr>
+      <w:r>
+        <w:rPr>
+          <w:rFonts w:ascii="Arial" w:hAnsi="Arial" w:cs="Arial"/>
+          <w:sz w:val="20"/>
+          <w:szCs w:val="20"/>
+        </w:rPr>
+        <w:t xml:space="preserve">{#next_of_kin}{name}</w:t>
+      </w:r>
+      <w:r>
+        <w:rPr>
+          <w:rFonts w:ascii="Arial" w:hAnsi="Arial" w:cs="Arial"/>
+          <w:sz w:val="20"/>
+          <w:szCs w:val="20"/>
+        </w:rPr>
+        <w:tab/>
+      </w:r>
+      <w:r>
+        <w:rPr>
+          <w:rFonts w:ascii="Arial" w:hAnsi="Arial" w:cs="Arial"/>
+          <w:sz w:val="20"/>
+          <w:szCs w:val="20"/>
+        </w:rPr>
+        <w:t xml:space="preserve">{address}</w:t>
+      </w:r>
+      <w:r>
+        <w:rPr>
+          <w:rFonts w:ascii="Arial" w:hAnsi="Arial" w:cs="Arial"/>
+          <w:sz w:val="20"/>
+          <w:szCs w:val="20"/>
+        </w:rPr>
+        <w:tab/>
+      </w:r>
+      <w:r>
+        <w:rPr>
+          <w:rFonts w:ascii="Arial" w:hAnsi="Arial" w:cs="Arial"/>
+          <w:sz w:val="20"/>
+          <w:szCs w:val="20"/>
+        </w:rPr>
+        <w:t xml:space="preserve">{relationship}{/next_of_kin}</w:t>
+      </w:r>
     </w:p>
     <w:p>
       <w:pPr>
@@ -1337,54 +1282,6 @@
         <w:tab/>
         <w:t>The proposed emergency temporary guardian should be appointed because:</w:t>
       </w:r>
-    </w:p>
-    <w:p>
-      <w:pPr>
-        <w:widowControl/>
-        <w:tabs>
-          <w:tab w:val="left" w:pos="-1440"/>
-          <w:tab w:val="left" w:pos="-720"/>
-          <w:tab w:val="left" w:pos="0"/>
-          <w:tab w:val="left" w:pos="720"/>
-          <w:tab w:val="left" w:pos="1440"/>
-          <w:tab w:val="left" w:pos="2160"/>
-          <w:tab w:val="left" w:pos="2880"/>
-          <w:tab w:val="left" w:pos="3600"/>
-          <w:tab w:val="left" w:pos="4320"/>
-          <w:tab w:val="left" w:pos="5040"/>
-          <w:tab w:val="left" w:pos="5760"/>
-        </w:tabs>
-        <w:jc w:val="both"/>
-        <w:rPr>
-          <w:rFonts w:ascii="Arial" w:hAnsi="Arial" w:cs="Arial"/>
-          <w:sz w:val="20"/>
-          <w:szCs w:val="20"/>
-        </w:rPr>
-      </w:pPr>
-    </w:p>
-    <w:p>
-      <w:pPr>
-        <w:widowControl/>
-        <w:tabs>
-          <w:tab w:val="left" w:pos="-1440"/>
-          <w:tab w:val="left" w:pos="-720"/>
-          <w:tab w:val="left" w:pos="0"/>
-          <w:tab w:val="left" w:pos="720"/>
-          <w:tab w:val="left" w:pos="1440"/>
-          <w:tab w:val="left" w:pos="2160"/>
-          <w:tab w:val="left" w:pos="2880"/>
-          <w:tab w:val="left" w:pos="3600"/>
-          <w:tab w:val="left" w:pos="4320"/>
-          <w:tab w:val="left" w:pos="5040"/>
-          <w:tab w:val="left" w:pos="5760"/>
-        </w:tabs>
-        <w:jc w:val="both"/>
-        <w:rPr>
-          <w:rFonts w:ascii="Arial" w:hAnsi="Arial" w:cs="Arial"/>
-          <w:sz w:val="20"/>
-          <w:szCs w:val="20"/>
-        </w:rPr>
-      </w:pPr>
     </w:p>
     <w:p>
       <w:pPr>
@@ -1415,6 +1312,14 @@
           <w:noEndnote/>
         </w:sectPr>
       </w:pPr>
+      <w:r>
+        <w:rPr>
+          <w:rFonts w:ascii="Arial" w:hAnsi="Arial" w:cs="Arial"/>
+          <w:sz w:val="20"/>
+          <w:szCs w:val="20"/>
+        </w:rPr>
+        <w:t xml:space="preserve">{appointment_reason}</w:t>
+      </w:r>
     </w:p>
     <w:p>
       <w:pPr>
@@ -1475,31 +1380,14 @@
           <w:szCs w:val="20"/>
         </w:rPr>
       </w:pPr>
-    </w:p>
-    <w:p>
-      <w:pPr>
-        <w:widowControl/>
-        <w:tabs>
-          <w:tab w:val="left" w:pos="-1440"/>
-          <w:tab w:val="left" w:pos="-720"/>
-          <w:tab w:val="left" w:pos="0"/>
-          <w:tab w:val="left" w:pos="720"/>
-          <w:tab w:val="left" w:pos="1440"/>
-          <w:tab w:val="left" w:pos="2160"/>
-          <w:tab w:val="left" w:pos="2880"/>
-          <w:tab w:val="left" w:pos="3600"/>
-          <w:tab w:val="left" w:pos="4320"/>
-          <w:tab w:val="left" w:pos="5040"/>
-          <w:tab w:val="left" w:pos="5760"/>
-        </w:tabs>
-        <w:spacing w:line="480" w:lineRule="auto"/>
-        <w:jc w:val="both"/>
-        <w:rPr>
-          <w:rFonts w:ascii="Arial" w:hAnsi="Arial" w:cs="Arial"/>
-          <w:sz w:val="20"/>
-          <w:szCs w:val="20"/>
-        </w:rPr>
-      </w:pPr>
+      <w:r>
+        <w:rPr>
+          <w:rFonts w:ascii="Arial" w:hAnsi="Arial" w:cs="Arial"/>
+          <w:sz w:val="20"/>
+          <w:szCs w:val="20"/>
+        </w:rPr>
+        <w:t xml:space="preserve">{property_nature_value}</w:t>
+      </w:r>
     </w:p>
     <w:p>
       <w:pPr>
@@ -2082,11 +1970,8 @@
           <w:rFonts w:ascii="Arial" w:hAnsi="Arial" w:cs="Arial"/>
           <w:sz w:val="20"/>
           <w:szCs w:val="20"/>
-          <w:u w:val="single"/>
-        </w:rPr>
-        <w:t>_</w:t>
-        <w:tab/>
-        <w:t xml:space="preserve">                                   </w:t>
+        </w:rPr>
+        <w:t xml:space="preserve">{attorney_email}</w:t>
       </w:r>
     </w:p>
     <w:p>
@@ -2341,17 +2226,7 @@
           <w:sz w:val="20"/>
           <w:szCs w:val="20"/>
         </w:rPr>
-        <w:t xml:space="preserve">Telephone:  </w:t>
-      </w:r>
-      <w:r>
-        <w:rPr>
-          <w:rFonts w:ascii="Arial" w:hAnsi="Arial" w:cs="Arial"/>
-          <w:sz w:val="20"/>
-          <w:szCs w:val="20"/>
-          <w:u w:val="single"/>
-        </w:rPr>
-        <w:tab/>
-        <w:t xml:space="preserve">                            </w:t>
+        <w:t xml:space="preserve">Telephone:  {attorney_phone}</w:t>
       </w:r>
     </w:p>
     <w:p>

</xml_diff>